<commit_message>
zynara: TDD v2 — branded masthead + running header
Adds a masthead image at the top of Care-Approval-IQ-TDD-V2.docx matching
the architecture SVG's identity (teal seal logo, zynara / HEALTH wordmark,
Care Approval IQ, "Proof beats paperwork.", the Microsoft Agent Framework
pill, the attribution column, the teal rule), plus a light running header
on every page. Sources in docs/design/tdd-v2-figures/masthead.svg.

Co-Authored-By: Claude Sonnet 5 <noreply@anthropic.com>
</commit_message>
<xml_diff>
--- a/zynara/docs/design/Care-Approval-IQ-TDD-V2.docx
+++ b/zynara/docs/design/Care-Approval-IQ-TDD-V2.docx
@@ -4,59 +4,43 @@
   <w:body>
     <w:p>
       <w:pPr>
-        <w:spacing w:after="40"/>
+        <w:spacing w:before="0" w:after="80"/>
+        <w:jc w:val="center"/>
       </w:pPr>
       <w:r>
-        <w:rPr>
-          <w:b/>
-          <w:color w:val="0C7F76"/>
-          <w:sz w:val="44"/>
-        </w:rPr>
-        <w:t>Care Approval IQ</w:t>
+        <w:drawing>
+          <wp:inline xmlns:a="http://schemas.openxmlformats.org/drawingml/2006/main" xmlns:pic="http://schemas.openxmlformats.org/drawingml/2006/picture">
+            <wp:extent cx="6400800" cy="402717"/>
+            <wp:docPr id="1" name="Picture 1"/>
+            <wp:cNvGraphicFramePr>
+              <a:graphicFrameLocks noChangeAspect="1"/>
+            </wp:cNvGraphicFramePr>
+            <a:graphic>
+              <a:graphicData uri="http://schemas.openxmlformats.org/drawingml/2006/picture">
+                <pic:pic>
+                  <pic:nvPicPr>
+                    <pic:cNvPr id="0" name="masthead.png"/>
+                    <pic:cNvPicPr/>
+                  </pic:nvPicPr>
+                  <pic:blipFill>
+                    <a:blip r:embed="rId10"/>
+                    <a:stretch>
+                      <a:fillRect/>
+                    </a:stretch>
+                  </pic:blipFill>
+                  <pic:spPr>
+                    <a:xfrm>
+                      <a:off x="0" y="0"/>
+                      <a:ext cx="6400800" cy="402717"/>
+                    </a:xfrm>
+                    <a:prstGeom prst="rect"/>
+                  </pic:spPr>
+                </pic:pic>
+              </a:graphicData>
+            </a:graphic>
+          </wp:inline>
+        </w:drawing>
       </w:r>
-      <w:r>
-        <w:rPr>
-          <w:b/>
-          <w:color w:val="122A32"/>
-          <w:sz w:val="24"/>
-        </w:rPr>
-        <w:t xml:space="preserve">   Technical Design Document · v2</w:t>
-      </w:r>
-    </w:p>
-    <w:p>
-      <w:pPr>
-        <w:spacing w:after="40"/>
-      </w:pPr>
-      <w:r>
-        <w:rPr>
-          <w:b w:val="0"/>
-          <w:i/>
-          <w:color w:val="0C7F76"/>
-          <w:sz w:val="22"/>
-        </w:rPr>
-        <w:t>Proof beats paperwork.</w:t>
-      </w:r>
-    </w:p>
-    <w:p>
-      <w:pPr>
-        <w:spacing w:after="80"/>
-      </w:pPr>
-      <w:r>
-        <w:rPr>
-          <w:b w:val="0"/>
-          <w:i w:val="0"/>
-          <w:color w:val="44555C"/>
-          <w:sz w:val="18"/>
-        </w:rPr>
-        <w:t>Zynara Health (fictional) · Deepak Kumar · Architect Track · Microsoft Agent-a-thon 2026 · built on the Microsoft Agent Framework</w:t>
-      </w:r>
-    </w:p>
-    <w:p>
-      <w:pPr>
-        <w:pBdr>
-          <w:bottom w:val="single" w:sz="6" w:color="0FA3A0"/>
-        </w:pBdr>
-      </w:pPr>
     </w:p>
     <w:p>
       <w:pPr>
@@ -101,7 +85,7 @@
         <w:drawing>
           <wp:inline xmlns:a="http://schemas.openxmlformats.org/drawingml/2006/main" xmlns:pic="http://schemas.openxmlformats.org/drawingml/2006/picture">
             <wp:extent cx="6126480" cy="2570058"/>
-            <wp:docPr id="1" name="Picture 1"/>
+            <wp:docPr id="2" name="Picture 2"/>
             <wp:cNvGraphicFramePr>
               <a:graphicFrameLocks noChangeAspect="1"/>
             </wp:cNvGraphicFramePr>
@@ -113,7 +97,7 @@
                     <pic:cNvPicPr/>
                   </pic:nvPicPr>
                   <pic:blipFill>
-                    <a:blip r:embed="rId9"/>
+                    <a:blip r:embed="rId11"/>
                     <a:stretch>
                       <a:fillRect/>
                     </a:stretch>
@@ -215,7 +199,7 @@
         <w:drawing>
           <wp:inline xmlns:a="http://schemas.openxmlformats.org/drawingml/2006/main" xmlns:pic="http://schemas.openxmlformats.org/drawingml/2006/picture">
             <wp:extent cx="6126480" cy="2352568"/>
-            <wp:docPr id="2" name="Picture 2"/>
+            <wp:docPr id="3" name="Picture 3"/>
             <wp:cNvGraphicFramePr>
               <a:graphicFrameLocks noChangeAspect="1"/>
             </wp:cNvGraphicFramePr>
@@ -227,7 +211,7 @@
                     <pic:cNvPicPr/>
                   </pic:nvPicPr>
                   <pic:blipFill>
-                    <a:blip r:embed="rId10"/>
+                    <a:blip r:embed="rId12"/>
                     <a:stretch>
                       <a:fillRect/>
                     </a:stretch>
@@ -374,7 +358,7 @@
         <w:drawing>
           <wp:inline xmlns:a="http://schemas.openxmlformats.org/drawingml/2006/main" xmlns:pic="http://schemas.openxmlformats.org/drawingml/2006/picture">
             <wp:extent cx="6126480" cy="2560869"/>
-            <wp:docPr id="3" name="Picture 3"/>
+            <wp:docPr id="4" name="Picture 4"/>
             <wp:cNvGraphicFramePr>
               <a:graphicFrameLocks noChangeAspect="1"/>
             </wp:cNvGraphicFramePr>
@@ -386,7 +370,7 @@
                     <pic:cNvPicPr/>
                   </pic:nvPicPr>
                   <pic:blipFill>
-                    <a:blip r:embed="rId11"/>
+                    <a:blip r:embed="rId13"/>
                     <a:stretch>
                       <a:fillRect/>
                     </a:stretch>
@@ -991,7 +975,7 @@
         <w:drawing>
           <wp:inline xmlns:a="http://schemas.openxmlformats.org/drawingml/2006/main" xmlns:pic="http://schemas.openxmlformats.org/drawingml/2006/picture">
             <wp:extent cx="6126480" cy="2187153"/>
-            <wp:docPr id="4" name="Picture 4"/>
+            <wp:docPr id="5" name="Picture 5"/>
             <wp:cNvGraphicFramePr>
               <a:graphicFrameLocks noChangeAspect="1"/>
             </wp:cNvGraphicFramePr>
@@ -1003,7 +987,7 @@
                     <pic:cNvPicPr/>
                   </pic:nvPicPr>
                   <pic:blipFill>
-                    <a:blip r:embed="rId12"/>
+                    <a:blip r:embed="rId14"/>
                     <a:stretch>
                       <a:fillRect/>
                     </a:stretch>
@@ -1058,7 +1042,7 @@
         <w:drawing>
           <wp:inline xmlns:a="http://schemas.openxmlformats.org/drawingml/2006/main" xmlns:pic="http://schemas.openxmlformats.org/drawingml/2006/picture">
             <wp:extent cx="6309360" cy="3455588"/>
-            <wp:docPr id="5" name="Picture 5"/>
+            <wp:docPr id="6" name="Picture 6"/>
             <wp:cNvGraphicFramePr>
               <a:graphicFrameLocks noChangeAspect="1"/>
             </wp:cNvGraphicFramePr>
@@ -1070,7 +1054,7 @@
                     <pic:cNvPicPr/>
                   </pic:nvPicPr>
                   <pic:blipFill>
-                    <a:blip r:embed="rId13"/>
+                    <a:blip r:embed="rId15"/>
                     <a:stretch>
                       <a:fillRect/>
                     </a:stretch>
@@ -2167,6 +2151,7 @@
       </w:r>
     </w:p>
     <w:sectPr>
+      <w:headerReference w:type="default" r:id="rId9"/>
       <w:pgSz w:w="12240" w:h="15840"/>
       <w:pgMar w:top="1080" w:right="1152" w:bottom="1080" w:left="1152" w:header="720" w:footer="720" w:gutter="0"/>
       <w:cols w:space="720"/>
@@ -2174,6 +2159,32 @@
     </w:sectPr>
   </w:body>
 </w:document>
+</file>
+
+<file path=word/header1.xml><?xml version="1.0" encoding="utf-8"?>
+<w:hdr xmlns:m="http://schemas.openxmlformats.org/officeDocument/2006/math" xmlns:mc="http://schemas.openxmlformats.org/markup-compatibility/2006" xmlns:mo="http://schemas.microsoft.com/office/mac/office/2008/main" xmlns:mv="urn:schemas-microsoft-com:mac:vml" xmlns:o="urn:schemas-microsoft-com:office:office" xmlns:r="http://schemas.openxmlformats.org/officeDocument/2006/relationships" xmlns:v="urn:schemas-microsoft-com:vml" xmlns:w10="urn:schemas-microsoft-com:office:word" xmlns:w14="http://schemas.microsoft.com/office/word/2010/wordml" xmlns:w="http://schemas.openxmlformats.org/wordprocessingml/2006/main" xmlns:wne="http://schemas.microsoft.com/office/word/2006/wordml" xmlns:wp14="http://schemas.microsoft.com/office/word/2010/wordprocessingDrawing" xmlns:wp="http://schemas.openxmlformats.org/drawingml/2006/wordprocessingDrawing" xmlns:wpc="http://schemas.microsoft.com/office/word/2010/wordprocessingCanvas" xmlns:wpg="http://schemas.microsoft.com/office/word/2010/wordprocessingGroup" xmlns:wpi="http://schemas.microsoft.com/office/word/2010/wordprocessingInk" xmlns:wps="http://schemas.microsoft.com/office/word/2010/wordprocessingShape" mc:Ignorable="w14 wp14">
+  <w:p>
+    <w:pPr>
+      <w:pStyle w:val="Header"/>
+    </w:pPr>
+    <w:r/>
+    <w:r>
+      <w:rPr>
+        <w:b/>
+        <w:color w:val="0C7F76"/>
+        <w:sz w:val="16"/>
+      </w:rPr>
+      <w:t>zynara  ·  Care Approval IQ</w:t>
+    </w:r>
+    <w:r>
+      <w:rPr>
+        <w:color w:val="44555C"/>
+        <w:sz w:val="16"/>
+      </w:rPr>
+      <w:t xml:space="preserve">      Technical Design Document · v2  ·  Microsoft Agent Framework</w:t>
+    </w:r>
+  </w:p>
+</w:hdr>
 </file>
 
 <file path=word/numbering.xml><?xml version="1.0" encoding="utf-8"?>

</xml_diff>